<commit_message>
Expand Calloway corpus to 18 docs with varied structures, rename competitor/product names, regenerate doc eval set
</commit_message>
<xml_diff>
--- a/demo/company-docs/eng-design-doc-riptrace-integration.docx
+++ b/demo/company-docs/eng-design-doc-riptrace-integration.docx
@@ -7,7 +7,7 @@
         <w:pStyle w:val="Title"/>
       </w:pPr>
       <w:r>
-        <w:t>Engineering Design Doc: Tidewater Integration with Calloway Control Plane</w:t>
+        <w:t>Engineering Design Doc: Riptrace Integration with Calloway Control Plane</w:t>
       </w:r>
     </w:p>
     <w:tbl>
@@ -131,22 +131,22 @@
     <w:p/>
     <w:p>
       <w:r>
-        <w:t>CONFIDENTIAL. Platform Engineering. Status: draft for review. Authors: Platform Architecture group. This document describes how the Tidewater change data capture engine acquired from Ferrolake will be integrated into the Calloway control plane in 2027.</w:t>
+        <w:t>CONFIDENTIAL. Platform Engineering. Status: draft for review. Authors: Platform Architecture group. This document describes how the Riptrace change data capture engine acquired from Ferrolake will be integrated into the Calloway control plane in 2027.</w:t>
       </w:r>
     </w:p>
     <w:p>
       <w:r>
-        <w:t>Goals. Run Tidewater pipelines as first class tenants of the Calloway control plane. Achieve p50 end to end latency under 1.5 seconds and p99 under 6 seconds from warehouse commit to dashboard render. Reuse Calloway identity, billing and audit services. Retire Ferrolake's standalone Kubernetes clusters in eu-west by Q4 2027.</w:t>
+        <w:t>Goals. Run Riptrace pipelines as first class tenants of the Calloway control plane. Achieve p50 end to end latency under 1.5 seconds and p99 under 6 seconds from warehouse commit to dashboard render. Reuse Calloway identity, billing and audit services. Retire Ferrolake's standalone Kubernetes clusters in eu-west by Q4 2027.</w:t>
       </w:r>
     </w:p>
     <w:p>
       <w:r>
-        <w:t>Non goals. We will not rewrite the Tidewater log reader, which is written in Rust and performs well. We will not support on premises deployment in 2027. We will not support Oracle as a source until 2028.</w:t>
+        <w:t>Non goals. We will not rewrite the Riptrace log reader, which is written in Rust and performs well. We will not support on premises deployment in 2027. We will not support Oracle as a source until 2028.</w:t>
       </w:r>
     </w:p>
     <w:p>
       <w:r>
-        <w:t>Architecture. Each customer stream is represented by a StreamSpec object stored in the control plane database. A new service, tidewater-operator, reconciles StreamSpecs into Tidewater worker deployments running in the shared data plane. Workers read from the source database replication log, transform change events into Arrow record batches, and publish them to a per tenant topic on our internal message bus, codenamed Conduit. The dashboard query engine subscribes to Conduit and applies incremental updates to materialized aggregates.</w:t>
+        <w:t>Architecture. Each customer stream is represented by a StreamSpec object stored in the control plane database. A new service, riptrace-operator, reconciles StreamSpecs into Riptrace worker deployments running in the shared data plane. Workers read from the source database replication log, transform change events into Arrow record batches, and publish them to a per tenant topic on our internal message bus, codenamed Conduit. The dashboard query engine subscribes to Conduit and applies incremental updates to materialized aggregates.</w:t>
       </w:r>
     </w:p>
     <w:p>
@@ -154,7 +154,7 @@
         <w:pStyle w:val="ListBullet"/>
       </w:pPr>
       <w:r>
-        <w:t>tidewater-operator: Go service, reconciles StreamSpec to worker deployments</w:t>
+        <w:t>riptrace-operator: Go service, reconciles StreamSpec to worker deployments</w:t>
       </w:r>
     </w:p>
     <w:p>
@@ -162,7 +162,7 @@
         <w:pStyle w:val="ListBullet"/>
       </w:pPr>
       <w:r>
-        <w:t>tidewater-worker: existing Rust binary, packaged with the Calloway base image</w:t>
+        <w:t>riptrace-worker: existing Rust binary, packaged with the Calloway base image</w:t>
       </w:r>
     </w:p>
     <w:p>
@@ -201,7 +201,7 @@
     </w:p>
     <w:p>
       <w:r>
-        <w:t>Migration plan. Phase 1 runs Tidewater unchanged in Ferrolake clusters with federation to our identity provider. Phase 2 moves new streams to the shared data plane. Phase 3 migrates existing Ferrolake customers during scheduled maintenance windows with dual write and checksum verification. Rollback for any stream is achieved by repointing the subscriber to the legacy cluster.</w:t>
+        <w:t>Migration plan. Phase 1 runs Riptrace unchanged in Ferrolake clusters with federation to our identity provider. Phase 2 moves new streams to the shared data plane. Phase 3 migrates existing Ferrolake customers during scheduled maintenance windows with dual write and checksum verification. Rollback for any stream is achieved by repointing the subscriber to the legacy cluster.</w:t>
       </w:r>
     </w:p>
     <w:p>
@@ -722,6 +722,229 @@
         <w:t>Open questions. Should Conduit retention be configurable per tenant for regulated customers? Can aggregate-updater handle late arriving events older than 24 hours without full recompute? Who owns on call for the Rust worker after the Ferrolake engineers' retention period ends?</w:t>
       </w:r>
     </w:p>
+    <w:p>
+      <w:pPr>
+        <w:pStyle w:val="Heading2"/>
+      </w:pPr>
+      <w:r>
+        <w:t>Security review checklist</w:t>
+      </w:r>
+    </w:p>
+    <w:tbl>
+      <w:tblPr>
+        <w:tblStyle w:val="LightGrid-Accent1"/>
+        <w:tblW w:type="auto" w:w="0"/>
+        <w:tblLook w:firstColumn="1" w:firstRow="1" w:lastColumn="0" w:lastRow="0" w:noHBand="0" w:noVBand="1" w:val="04A0"/>
+      </w:tblPr>
+      <w:tblGrid>
+        <w:gridCol w:w="2880"/>
+        <w:gridCol w:w="2880"/>
+        <w:gridCol w:w="2880"/>
+      </w:tblGrid>
+      <w:tr>
+        <w:tc>
+          <w:tcPr>
+            <w:tcW w:type="dxa" w:w="2880"/>
+          </w:tcPr>
+          <w:p>
+            <w:r>
+              <w:t>Item</w:t>
+            </w:r>
+          </w:p>
+        </w:tc>
+        <w:tc>
+          <w:tcPr>
+            <w:tcW w:type="dxa" w:w="2880"/>
+          </w:tcPr>
+          <w:p>
+            <w:r>
+              <w:t>Status</w:t>
+            </w:r>
+          </w:p>
+        </w:tc>
+        <w:tc>
+          <w:tcPr>
+            <w:tcW w:type="dxa" w:w="2880"/>
+          </w:tcPr>
+          <w:p>
+            <w:r>
+              <w:t>Reviewer</w:t>
+            </w:r>
+          </w:p>
+        </w:tc>
+      </w:tr>
+      <w:tr>
+        <w:tc>
+          <w:tcPr>
+            <w:tcW w:type="dxa" w:w="2880"/>
+          </w:tcPr>
+          <w:p>
+            <w:r>
+              <w:t>per tenant workload identity</w:t>
+            </w:r>
+          </w:p>
+        </w:tc>
+        <w:tc>
+          <w:tcPr>
+            <w:tcW w:type="dxa" w:w="2880"/>
+          </w:tcPr>
+          <w:p>
+            <w:r>
+              <w:t>designed</w:t>
+            </w:r>
+          </w:p>
+        </w:tc>
+        <w:tc>
+          <w:tcPr>
+            <w:tcW w:type="dxa" w:w="2880"/>
+          </w:tcPr>
+          <w:p>
+            <w:r>
+              <w:t>K. Torres</w:t>
+            </w:r>
+          </w:p>
+        </w:tc>
+      </w:tr>
+      <w:tr>
+        <w:tc>
+          <w:tcPr>
+            <w:tcW w:type="dxa" w:w="2880"/>
+          </w:tcPr>
+          <w:p>
+            <w:r>
+              <w:t>source creds never in env vars</w:t>
+            </w:r>
+          </w:p>
+        </w:tc>
+        <w:tc>
+          <w:tcPr>
+            <w:tcW w:type="dxa" w:w="2880"/>
+          </w:tcPr>
+          <w:p>
+            <w:r>
+              <w:t>designed</w:t>
+            </w:r>
+          </w:p>
+        </w:tc>
+        <w:tc>
+          <w:tcPr>
+            <w:tcW w:type="dxa" w:w="2880"/>
+          </w:tcPr>
+          <w:p>
+            <w:r>
+              <w:t>K. Torres</w:t>
+            </w:r>
+          </w:p>
+        </w:tc>
+      </w:tr>
+      <w:tr>
+        <w:tc>
+          <w:tcPr>
+            <w:tcW w:type="dxa" w:w="2880"/>
+          </w:tcPr>
+          <w:p>
+            <w:r>
+              <w:t>Conduit encryption at rest with CMEK</w:t>
+            </w:r>
+          </w:p>
+        </w:tc>
+        <w:tc>
+          <w:tcPr>
+            <w:tcW w:type="dxa" w:w="2880"/>
+          </w:tcPr>
+          <w:p>
+            <w:r>
+              <w:t>designed</w:t>
+            </w:r>
+          </w:p>
+        </w:tc>
+        <w:tc>
+          <w:tcPr>
+            <w:tcW w:type="dxa" w:w="2880"/>
+          </w:tcPr>
+          <w:p>
+            <w:r>
+              <w:t>N. Petrov</w:t>
+            </w:r>
+          </w:p>
+        </w:tc>
+      </w:tr>
+      <w:tr>
+        <w:tc>
+          <w:tcPr>
+            <w:tcW w:type="dxa" w:w="2880"/>
+          </w:tcPr>
+          <w:p>
+            <w:r>
+              <w:t>egress allow list per worker</w:t>
+            </w:r>
+          </w:p>
+        </w:tc>
+        <w:tc>
+          <w:tcPr>
+            <w:tcW w:type="dxa" w:w="2880"/>
+          </w:tcPr>
+          <w:p>
+            <w:r>
+              <w:t>open</w:t>
+            </w:r>
+          </w:p>
+        </w:tc>
+        <w:tc>
+          <w:tcPr>
+            <w:tcW w:type="dxa" w:w="2880"/>
+          </w:tcPr>
+          <w:p>
+            <w:r>
+              <w:t>Security</w:t>
+            </w:r>
+          </w:p>
+        </w:tc>
+      </w:tr>
+      <w:tr>
+        <w:tc>
+          <w:tcPr>
+            <w:tcW w:type="dxa" w:w="2880"/>
+          </w:tcPr>
+          <w:p>
+            <w:r>
+              <w:t>GPL crate removal before migration</w:t>
+            </w:r>
+          </w:p>
+        </w:tc>
+        <w:tc>
+          <w:tcPr>
+            <w:tcW w:type="dxa" w:w="2880"/>
+          </w:tcPr>
+          <w:p>
+            <w:r>
+              <w:t>in progress</w:t>
+            </w:r>
+          </w:p>
+        </w:tc>
+        <w:tc>
+          <w:tcPr>
+            <w:tcW w:type="dxa" w:w="2880"/>
+          </w:tcPr>
+          <w:p>
+            <w:r>
+              <w:t>Ferrolake team</w:t>
+            </w:r>
+          </w:p>
+        </w:tc>
+      </w:tr>
+    </w:tbl>
+    <w:p/>
+    <w:p>
+      <w:r>
+        <w:t>Cost note from FinOps: at 61k per month the streaming compute line would be the third largest in our cloud bill. The pooled worker class proposed by Sanjay could cut this by roughly 35 percent for the long tail of small tenants.</w:t>
+      </w:r>
+    </w:p>
+    <w:p>
+      <w:r>
+        <w:t>Next steps: design review on Oct 20, then a spike to run the Rust worker in our base image by end of October. Comments in the doc please, not in Slack, so we have a record.</w:t>
+      </w:r>
+    </w:p>
     <w:sectPr>
       <w:headerReference w:type="default" r:id="rId9"/>
       <w:footerReference w:type="default" r:id="rId10"/>
@@ -741,7 +964,7 @@
       <w:pStyle w:val="Footer"/>
     </w:pPr>
     <w:r>
-      <w:t>Engineering Design Doc: Tidewater Integration with Calloway Control Plane | 0.4 DRAFT | Internal use only</w:t>
+      <w:t>Engineering Design Doc: Riptrace Integration with Calloway Control Plane | 0.4 DRAFT | Internal use only</w:t>
     </w:r>
   </w:p>
 </w:ftr>

</xml_diff>